<commit_message>
Invoice: period August 2026 — no placeholders left
Last field filled. The invoice is complete: MD1, 21 August 2026, period
August 2026, R 28 517.40. PDF and Word both re-verified at one page and
checked for leftover placeholder brackets.

Co-Authored-By: Claude Fable 5 <noreply@anthropic.com>
Claude-Session: https://claude.ai/code/session_01VJrbxoPEUBK1o482gxajXL
</commit_message>
<xml_diff>
--- a/conveyancing/invoices/Maryke-Invoice-Firm-Setup.docx
+++ b/conveyancing/invoices/Maryke-Invoice-Firm-Setup.docx
@@ -810,13 +810,11 @@
                   <w:r>
                     <w:rPr>
                       <w:rFonts w:ascii="Arial" w:cs="Arial" w:eastAsia="Arial" w:hAnsi="Arial"/>
-                      <w:i/>
-                      <w:iCs/>
-                      <w:color w:val="9AA6B6"/>
+                      <w:color w:val="1B2B40"/>
                       <w:sz w:val="17"/>
                       <w:szCs w:val="17"/>
                     </w:rPr>
-                    <w:t xml:space="preserve">[Month – Month 2026]</w:t>
+                    <w:t xml:space="preserve">August 2026</w:t>
                   </w:r>
                 </w:p>
               </w:tc>

</xml_diff>